<commit_message>
Agregados DTO para cada clase relevante, tests cambiados para no ser unitario. Reducida la lista de requerimientos en word.
</commit_message>
<xml_diff>
--- a/Documentacion/TPO POO - Grupo 2 - Pac-Man Básico - Fase A 1.docx
+++ b/Documentacion/TPO POO - Grupo 2 - Pac-Man Básico - Fase A 1.docx
@@ -341,10 +341,8 @@
         <w:rPr/>
       </w:pPr>
       <w:r>
-        <w:rPr/>
-        <w:t xml:space="preserve">El sistema debe disponer de un laberinto por el cual puedan desplazarse Pac-Man y los fantasmas.</w:t>
+        <w:t>Al iniciar una partida, el sistema debe preparar un laberinto con un Pac-Man, cuatro fantasmas, puntos comunes en los pasillos y cuatro súper puntos en las esquinas, e inicializar las vidas del jugador en tres.</w:t>
       </w:r>
-      <w:r/>
     </w:p>
     <w:p>
       <w:pPr>
@@ -361,30 +359,8 @@
         </w:rPr>
       </w:pPr>
       <w:r>
-        <w:rPr/>
-        <w:t xml:space="preserve">El sistema debe generar</w:t>
+        <w:t>El jugador debe poder indicar a Pac-Man una dirección entre arriba, abajo, izquierda y derecha. Pac-Man debe avanzar continuamente en su dirección actual y cambiarla cuando esté alineado con una celda y el camino solicitado sea válido, sin atravesar paredes.</w:t>
       </w:r>
-      <w:r>
-        <w:rPr/>
-        <w:t xml:space="preserve"> 1 Pac-Man</w:t>
-      </w:r>
-      <w:r>
-        <w:rPr/>
-        <w:t xml:space="preserve"> </w:t>
-      </w:r>
-      <w:r>
-        <w:rPr/>
-        <w:t xml:space="preserve">al</w:t>
-      </w:r>
-      <w:r>
-        <w:rPr/>
-        <w:t xml:space="preserve"> comienzo de la partida</w:t>
-      </w:r>
-      <w:r>
-        <w:rPr/>
-        <w:t xml:space="preserve">.</w:t>
-      </w:r>
-      <w:r/>
     </w:p>
     <w:p>
       <w:pPr>
@@ -398,10 +374,8 @@
         <w:rPr/>
       </w:pPr>
       <w:r>
-        <w:rPr/>
-        <w:t xml:space="preserve">El sistema debe permitir al usuario solicitar un cambio de dirección de Pac-Man hacia arriba, abajo, izquierda o derecha. El cambio se efectuará cuando Pac-Man esté alineado con una celda y la dirección solicitada sea válida.</w:t>
+        <w:t>Los cuatro fantasmas deben moverse de forma autónoma sin atravesar paredes. En cada cruce, un fantasma en estado normal debe elegir entre los caminos disponibles el que más lo acerque a Pac-Man.</w:t>
       </w:r>
-      <w:r/>
     </w:p>
     <w:p>
       <w:pPr>
@@ -415,10 +389,8 @@
         <w:rPr/>
       </w:pPr>
       <w:r>
-        <w:rPr/>
-        <w:t xml:space="preserve">El sistema debe desplazar continuamente a Pac-Man en su dirección actual, sin requerir que el usuario indique cada desplazamiento, hasta encontrar un obstáculo o efectuar un cambio de dirección válido.</w:t>
+        <w:t>Pac-Man debe poder comer puntos comunes y súper puntos. Cada punto comido debe desaparecer del laberinto y sumar 10 o 50 puntos al puntaje del jugador, respectivamente.</w:t>
       </w:r>
-      <w:r/>
     </w:p>
     <w:p>
       <w:pPr>
@@ -435,22 +407,8 @@
         </w:rPr>
       </w:pPr>
       <w:r>
-        <w:rPr/>
-        <w:t xml:space="preserve">El sistema debe generar</w:t>
+        <w:t>Al comer un súper punto, los fantasmas que no estén regresando a su origen deben quedar asustados durante un tiempo determinado. Mientras estén asustados deben moverse al azar y, al terminar ese tiempo, volver a su estado normal.</w:t>
       </w:r>
-      <w:r>
-        <w:rPr/>
-        <w:t xml:space="preserve"> 4 fantasmas</w:t>
-      </w:r>
-      <w:r>
-        <w:rPr/>
-        <w:t xml:space="preserve"> al comienzo de la partida</w:t>
-      </w:r>
-      <w:r>
-        <w:rPr/>
-        <w:t xml:space="preserve">.</w:t>
-      </w:r>
-      <w:r/>
     </w:p>
     <w:p>
       <w:pPr>
@@ -464,10 +422,8 @@
         <w:rPr/>
       </w:pPr>
       <w:r>
-        <w:rPr/>
-        <w:t xml:space="preserve">El sistema debe controlar a los fantasmas de forma autónoma moviéndolos dentro del laberinto.</w:t>
+        <w:t>Cuando Pac-Man colisiona con un fantasma asustado, debe poder comerlo y sumar 200 puntos. Ese fantasma debe regresar de forma autónoma a su origen y, al llegar, retomar la persecución normal.</w:t>
       </w:r>
-      <w:r/>
     </w:p>
     <w:p>
       <w:pPr>
@@ -481,10 +437,8 @@
         <w:rPr/>
       </w:pPr>
       <w:r>
-        <w:rPr/>
-        <w:t xml:space="preserve">Cuando un fantasma se encuentre en un cruce, el sistema deberá seleccionar entre las direcciones disponibles aquella que lo acerque más a Pac-Man.</w:t>
+        <w:t>Cuando Pac-Man colisiona con un fantasma normal, el jugador debe perder una vida. Si le quedan vidas, Pac-Man y los fantasmas deben volver a sus posiciones iniciales y estos últimos a su estado normal. Al perder la última vida, la partida debe finalizar en derrota.</w:t>
       </w:r>
-      <w:r/>
     </w:p>
     <w:p>
       <w:pPr>
@@ -498,10 +452,8 @@
         <w:rPr/>
       </w:pPr>
       <w:r>
-        <w:rPr/>
-        <w:t xml:space="preserve">El sistema no debe permitir que Pac-Man o los fantasmas atraviesen las paredes.</w:t>
+        <w:t>Cuando Pac-Man haya comido todos los puntos comunes y súper puntos del laberinto, la partida debe finalizar en victoria.</w:t>
       </w:r>
-      <w:r/>
     </w:p>
     <w:p>
       <w:pPr>
@@ -518,34 +470,8 @@
         </w:rPr>
       </w:pPr>
       <w:r>
-        <w:rPr/>
-        <w:t xml:space="preserve">El sistema debe generar p</w:t>
+        <w:t>El jugador debe poder pausar y reanudar la partida. Durante la pausa deben detenerse el movimiento de los personajes y el transcurso del tiempo del estado asustado.</w:t>
       </w:r>
-      <w:r>
-        <w:rPr/>
-        <w:t xml:space="preserve">untos </w:t>
-      </w:r>
-      <w:r>
-        <w:rPr/>
-        <w:t xml:space="preserve">distribuid</w:t>
-      </w:r>
-      <w:r>
-        <w:rPr/>
-        <w:t xml:space="preserve">o</w:t>
-      </w:r>
-      <w:r>
-        <w:rPr/>
-        <w:t xml:space="preserve">s por todos </w:t>
-      </w:r>
-      <w:r>
-        <w:rPr/>
-        <w:t xml:space="preserve">los pasillos del laberinto al comienzo de la partida</w:t>
-      </w:r>
-      <w:r>
-        <w:rPr/>
-        <w:t xml:space="preserve">.</w:t>
-      </w:r>
-      <w:r/>
     </w:p>
     <w:p>
       <w:pPr>
@@ -559,416 +485,8 @@
         <w:rPr/>
       </w:pPr>
       <w:r>
-        <w:rPr/>
-        <w:t xml:space="preserve">El sistema debe generar 4 super p</w:t>
+        <w:t>Después de una victoria o una derrota, el jugador debe poder comenzar una nueva partida.</w:t>
       </w:r>
-      <w:r>
-        <w:rPr/>
-        <w:t xml:space="preserve">untos</w:t>
-      </w:r>
-      <w:r>
-        <w:rPr/>
-        <w:t xml:space="preserve"> en las esquinas del laberinto al comienzo de la partida.</w:t>
-      </w:r>
-      <w:r/>
-    </w:p>
-    <w:p>
-      <w:pPr>
-        <w:pStyle w:val="705"/>
-        <w:numPr>
-          <w:ilvl w:val="0"/>
-          <w:numId w:val="7"/>
-        </w:numPr>
-        <w:spacing/>
-        <w:ind/>
-        <w:rPr/>
-      </w:pPr>
-      <w:r>
-        <w:rPr/>
-        <w:t xml:space="preserve">Al comer un super p</w:t>
-      </w:r>
-      <w:r>
-        <w:rPr/>
-        <w:t xml:space="preserve">unto</w:t>
-      </w:r>
-      <w:r>
-        <w:rPr/>
-        <w:t xml:space="preserve">, el sistema debe cambiar el estado de todos los </w:t>
-      </w:r>
-      <w:r>
-        <w:rPr/>
-        <w:t xml:space="preserve">fantasmas que no estén regresando al punto de origen </w:t>
-      </w:r>
-      <w:r>
-        <w:rPr/>
-        <w:t xml:space="preserve">a “asustado”.</w:t>
-      </w:r>
-      <w:r/>
-    </w:p>
-    <w:p>
-      <w:pPr>
-        <w:pStyle w:val="705"/>
-        <w:numPr>
-          <w:ilvl w:val="0"/>
-          <w:numId w:val="7"/>
-        </w:numPr>
-        <w:spacing/>
-        <w:ind/>
-        <w:rPr/>
-      </w:pPr>
-      <w:r>
-        <w:rPr/>
-        <w:t xml:space="preserve">El sistema debe devolver a la normalidad a los fantasmas asustados </w:t>
-      </w:r>
-      <w:r>
-        <w:rPr/>
-        <w:t xml:space="preserve">pasado un tiempo determinado.</w:t>
-      </w:r>
-      <w:r/>
-    </w:p>
-    <w:p>
-      <w:pPr>
-        <w:pStyle w:val="705"/>
-        <w:numPr>
-          <w:ilvl w:val="0"/>
-          <w:numId w:val="7"/>
-        </w:numPr>
-        <w:spacing/>
-        <w:ind/>
-        <w:rPr/>
-      </w:pPr>
-      <w:r>
-        <w:rPr/>
-        <w:t xml:space="preserve">El sistema debe permitir que Pac-Man coma a los fantasmas asustados al colisionar con ellos.</w:t>
-      </w:r>
-      <w:r/>
-    </w:p>
-    <w:p>
-      <w:pPr>
-        <w:pStyle w:val="705"/>
-        <w:numPr>
-          <w:ilvl w:val="0"/>
-          <w:numId w:val="7"/>
-        </w:numPr>
-        <w:spacing/>
-        <w:ind/>
-        <w:rPr/>
-      </w:pPr>
-      <w:r>
-        <w:rPr/>
-        <w:t xml:space="preserve">El sistema debe controlar a los fantasmas asustados </w:t>
-      </w:r>
-      <w:r>
-        <w:rPr/>
-        <w:t xml:space="preserve">para que se muevan de forma aleatoria.</w:t>
-      </w:r>
-      <w:r/>
-    </w:p>
-    <w:p>
-      <w:pPr>
-        <w:pStyle w:val="705"/>
-        <w:numPr>
-          <w:ilvl w:val="0"/>
-          <w:numId w:val="7"/>
-        </w:numPr>
-        <w:spacing/>
-        <w:ind/>
-        <w:rPr/>
-      </w:pPr>
-      <w:r>
-        <w:rPr/>
-        <w:t xml:space="preserve">El sistema debe controlar a los fantasmas comidos de forma autónoma para que vuelvan al punto de </w:t>
-      </w:r>
-      <w:r>
-        <w:rPr/>
-        <w:t xml:space="preserve">origen.</w:t>
-      </w:r>
-      <w:r/>
-    </w:p>
-    <w:p>
-      <w:pPr>
-        <w:pStyle w:val="705"/>
-        <w:numPr>
-          <w:ilvl w:val="0"/>
-          <w:numId w:val="7"/>
-        </w:numPr>
-        <w:spacing/>
-        <w:ind/>
-        <w:rPr/>
-      </w:pPr>
-      <w:r>
-        <w:rPr/>
-        <w:t xml:space="preserve">El sistema debe </w:t>
-      </w:r>
-      <w:r>
-        <w:rPr/>
-        <w:t xml:space="preserve">devolver</w:t>
-      </w:r>
-      <w:r>
-        <w:rPr/>
-        <w:t xml:space="preserve"> a los fantasmas comidos otra vez </w:t>
-      </w:r>
-      <w:r>
-        <w:rPr/>
-        <w:t xml:space="preserve">a su estado normal de persecución al llegar al punto de origen.</w:t>
-      </w:r>
-      <w:r/>
-    </w:p>
-    <w:p>
-      <w:pPr>
-        <w:pStyle w:val="705"/>
-        <w:numPr>
-          <w:ilvl w:val="0"/>
-          <w:numId w:val="7"/>
-        </w:numPr>
-        <w:spacing/>
-        <w:ind/>
-        <w:rPr/>
-      </w:pPr>
-      <w:r>
-        <w:rPr/>
-        <w:t xml:space="preserve">Al comenzar la partida, el sistema establece </w:t>
-      </w:r>
-      <w:r>
-        <w:rPr/>
-        <w:t xml:space="preserve">el puntaje</w:t>
-      </w:r>
-      <w:r>
-        <w:rPr/>
-        <w:t xml:space="preserve"> del jugador en 0.</w:t>
-      </w:r>
-      <w:r/>
-    </w:p>
-    <w:p>
-      <w:pPr>
-        <w:pStyle w:val="705"/>
-        <w:numPr>
-          <w:ilvl w:val="0"/>
-          <w:numId w:val="7"/>
-        </w:numPr>
-        <w:spacing/>
-        <w:ind/>
-        <w:rPr/>
-      </w:pPr>
-      <w:r>
-        <w:rPr/>
-        <w:t xml:space="preserve">Al comenzar la partida, el sistema establece las vidas del jugador en 3.</w:t>
-      </w:r>
-      <w:r/>
-    </w:p>
-    <w:p>
-      <w:pPr>
-        <w:pStyle w:val="705"/>
-        <w:numPr>
-          <w:ilvl w:val="0"/>
-          <w:numId w:val="7"/>
-        </w:numPr>
-        <w:spacing/>
-        <w:ind/>
-        <w:rPr>
-          <w:lang w:val="es-AR"/>
-        </w:rPr>
-      </w:pPr>
-      <w:r>
-        <w:rPr>
-          <w:lang w:val="es-AR"/>
-        </w:rPr>
-        <w:t xml:space="preserve">Al colisionar Pac-Man con un fantasma en estado normal, el sistema debe restar una vida al jugador. Si aún le quedan vidas, debe devolver a Pac-Man y a todos los fantasmas a sus posiciones iniciales, restableciendo el estado normal de los fantasmas.</w:t>
-      </w:r>
-      <w:r/>
-    </w:p>
-    <w:p>
-      <w:pPr>
-        <w:pStyle w:val="705"/>
-        <w:numPr>
-          <w:ilvl w:val="0"/>
-          <w:numId w:val="7"/>
-        </w:numPr>
-        <w:spacing/>
-        <w:ind/>
-        <w:rPr/>
-      </w:pPr>
-      <w:r>
-        <w:rPr/>
-        <w:t xml:space="preserve">Si el jugador pierde todas sus vidas, el sistema debe finalizar la partida indicando una derrota.</w:t>
-      </w:r>
-      <w:r/>
-    </w:p>
-    <w:p>
-      <w:pPr>
-        <w:pStyle w:val="705"/>
-        <w:numPr>
-          <w:ilvl w:val="0"/>
-          <w:numId w:val="7"/>
-        </w:numPr>
-        <w:spacing/>
-        <w:ind/>
-        <w:rPr>
-          <w:sz w:val="24"/>
-          <w:szCs w:val="24"/>
-        </w:rPr>
-      </w:pPr>
-      <w:r>
-        <w:rPr/>
-        <w:t xml:space="preserve">El sistema debe permitirle al jugador </w:t>
-      </w:r>
-      <w:r>
-        <w:rPr/>
-        <w:t xml:space="preserve">pausar la partida</w:t>
-      </w:r>
-      <w:r>
-        <w:rPr/>
-        <w:t xml:space="preserve">.</w:t>
-      </w:r>
-      <w:r/>
-    </w:p>
-    <w:p>
-      <w:pPr>
-        <w:pStyle w:val="705"/>
-        <w:numPr>
-          <w:ilvl w:val="0"/>
-          <w:numId w:val="7"/>
-        </w:numPr>
-        <w:spacing/>
-        <w:ind/>
-        <w:rPr/>
-      </w:pPr>
-      <w:r>
-        <w:rPr/>
-        <w:t xml:space="preserve">El sistema debe </w:t>
-      </w:r>
-      <w:r>
-        <w:rPr/>
-        <w:t xml:space="preserve">permitir reanudar</w:t>
-      </w:r>
-      <w:r>
-        <w:rPr/>
-        <w:t xml:space="preserve"> </w:t>
-      </w:r>
-      <w:r>
-        <w:rPr/>
-        <w:t xml:space="preserve">una partida pausada por el jugador.</w:t>
-      </w:r>
-      <w:r/>
-    </w:p>
-    <w:p>
-      <w:pPr>
-        <w:pStyle w:val="705"/>
-        <w:numPr>
-          <w:ilvl w:val="0"/>
-          <w:numId w:val="7"/>
-        </w:numPr>
-        <w:spacing/>
-        <w:ind/>
-        <w:rPr/>
-      </w:pPr>
-      <w:r>
-        <w:rPr/>
-        <w:t xml:space="preserve">Mientras la partida permanezca pausada, el sistema debe detener la actualización del estado del juego, incluyendo el movimiento de Pac-Man, el movimiento de los fantasmas y el transcurso del tiempo del estado asustado.</w:t>
-      </w:r>
-      <w:r/>
-    </w:p>
-    <w:p>
-      <w:pPr>
-        <w:pStyle w:val="705"/>
-        <w:numPr>
-          <w:ilvl w:val="0"/>
-          <w:numId w:val="7"/>
-        </w:numPr>
-        <w:spacing/>
-        <w:ind/>
-        <w:rPr/>
-      </w:pPr>
-      <w:r>
-        <w:rPr/>
-        <w:t xml:space="preserve">Al comer un punto común, el sistema debe incrementar el puntaje del jugador en 10 puntos.</w:t>
-      </w:r>
-      <w:r/>
-    </w:p>
-    <w:p>
-      <w:pPr>
-        <w:pStyle w:val="705"/>
-        <w:numPr>
-          <w:ilvl w:val="0"/>
-          <w:numId w:val="7"/>
-        </w:numPr>
-        <w:spacing/>
-        <w:ind/>
-        <w:rPr/>
-      </w:pPr>
-      <w:r>
-        <w:rPr/>
-        <w:t xml:space="preserve">Al comer un super punto, el sistema debe incrementar el puntaje del jugador en 50 puntos.</w:t>
-      </w:r>
-      <w:r/>
-    </w:p>
-    <w:p>
-      <w:pPr>
-        <w:pStyle w:val="705"/>
-        <w:numPr>
-          <w:ilvl w:val="0"/>
-          <w:numId w:val="7"/>
-        </w:numPr>
-        <w:spacing/>
-        <w:ind/>
-        <w:rPr/>
-      </w:pPr>
-      <w:r>
-        <w:rPr/>
-        <w:t xml:space="preserve">Al comer un fantasma asustado, el sistema debe incrementar el puntaje del jugador en 200 puntos.</w:t>
-      </w:r>
-      <w:r/>
-    </w:p>
-    <w:p>
-      <w:pPr>
-        <w:pStyle w:val="705"/>
-        <w:numPr>
-          <w:ilvl w:val="0"/>
-          <w:numId w:val="7"/>
-        </w:numPr>
-        <w:spacing/>
-        <w:ind/>
-        <w:rPr/>
-      </w:pPr>
-      <w:r>
-        <w:rPr/>
-        <w:t xml:space="preserve">Si un punto o super punto es comido por Pac-Man el sistema debe retirarlo del laberinto.</w:t>
-      </w:r>
-      <w:r/>
-    </w:p>
-    <w:p>
-      <w:pPr>
-        <w:pStyle w:val="705"/>
-        <w:numPr>
-          <w:ilvl w:val="0"/>
-          <w:numId w:val="7"/>
-        </w:numPr>
-        <w:spacing/>
-        <w:ind/>
-        <w:rPr/>
-      </w:pPr>
-      <w:r>
-        <w:rPr/>
-        <w:t xml:space="preserve">Cuando Pac-Man haya consumido todos los puntos comunes y super puntos del laberinto, el sistema debe finalizar la partida indicando victoria.</w:t>
-      </w:r>
-      <w:r/>
-    </w:p>
-    <w:p>
-      <w:pPr>
-        <w:pStyle w:val="705"/>
-        <w:numPr>
-          <w:ilvl w:val="0"/>
-          <w:numId w:val="7"/>
-        </w:numPr>
-        <w:spacing/>
-        <w:ind/>
-        <w:rPr/>
-      </w:pPr>
-      <w:r>
-        <w:rPr/>
-        <w:t xml:space="preserve">Una vez finalizada la partida, por victoria o derrota, el sistema debe permitirle al jugador comenzar una nueva partida.</w:t>
-      </w:r>
-      <w:r/>
     </w:p>
     <w:p>
       <w:pPr>
@@ -1087,6 +605,8 @@
       <w:tr xmlns:wp14="http://schemas.microsoft.com/office/word/2010/wordml" wp14:textId="77777777">
         <w:trPr>
           <w:trHeight w:val="300"/>
+          <w:cantSplit/>
+          <w:tblHeader w:val="true"/>
         </w:trPr>
         <w:tc>
           <w:tcPr>
@@ -1146,6 +666,7 @@
       <w:tr xmlns:wp14="http://schemas.microsoft.com/office/word/2010/wordml" wp14:textId="77777777">
         <w:trPr>
           <w:trHeight w:val="300"/>
+          <w:cantSplit/>
         </w:trPr>
         <w:tc>
           <w:tcPr>
@@ -1196,25 +717,15 @@
               <w:rPr/>
             </w:pPr>
             <w:r>
-              <w:t xml:space="preserve">RF1, RF2, RF5, RF9, RF10, RF17, RF18</w:t>
+              <w:t>RF1</w:t>
             </w:r>
-            <w:r/>
-          </w:p>
-          <w:p>
-            <w:pPr>
-              <w:pStyle w:val="677"/>
-              <w:spacing/>
-              <w:ind/>
-              <w:rPr/>
-            </w:pPr>
-            <w:r/>
-            <w:r/>
           </w:p>
         </w:tc>
       </w:tr>
       <w:tr xmlns:wp14="http://schemas.microsoft.com/office/word/2010/wordml" wp14:textId="77777777">
         <w:trPr>
           <w:trHeight w:val="300"/>
+          <w:cantSplit/>
         </w:trPr>
         <w:tc>
           <w:tcPr>
@@ -1265,15 +776,15 @@
               <w:rPr/>
             </w:pPr>
             <w:r>
-              <w:t xml:space="preserve">RF3</w:t>
+              <w:t>RF2</w:t>
             </w:r>
-            <w:r/>
           </w:p>
         </w:tc>
       </w:tr>
       <w:tr xmlns:wp14="http://schemas.microsoft.com/office/word/2010/wordml" wp14:textId="77777777">
         <w:trPr>
           <w:trHeight w:val="300"/>
+          <w:cantSplit/>
         </w:trPr>
         <w:tc>
           <w:tcPr>
@@ -1324,15 +835,15 @@
               <w:rPr/>
             </w:pPr>
             <w:r>
-              <w:t xml:space="preserve">RF6, RF7, RF8</w:t>
+              <w:t>RF3</w:t>
             </w:r>
-            <w:r/>
           </w:p>
         </w:tc>
       </w:tr>
       <w:tr xmlns:wp14="http://schemas.microsoft.com/office/word/2010/wordml" wp14:textId="77777777">
         <w:trPr>
           <w:trHeight w:val="300"/>
+          <w:cantSplit/>
         </w:trPr>
         <w:tc>
           <w:tcPr>
@@ -1383,15 +894,15 @@
               <w:rPr/>
             </w:pPr>
             <w:r>
-              <w:t xml:space="preserve">RF11, RF24, RF25, RF27, RF28</w:t>
+              <w:t>RF4, RF5, RF8</w:t>
             </w:r>
-            <w:r/>
           </w:p>
         </w:tc>
       </w:tr>
       <w:tr xmlns:wp14="http://schemas.microsoft.com/office/word/2010/wordml" wp14:textId="77777777">
         <w:trPr>
           <w:trHeight w:val="300"/>
+          <w:cantSplit/>
         </w:trPr>
         <w:tc>
           <w:tcPr>
@@ -1448,21 +959,15 @@
               <w:rPr/>
             </w:pPr>
             <w:r>
-              <w:rPr>
-                <w:rFonts w:ascii="Aptos" w:hAnsi="Aptos" w:eastAsia="Aptos" w:cs="Aptos"/>
-                <w:sz w:val="24"/>
-                <w:szCs w:val="24"/>
-                <w:lang w:val="es-AR"/>
-              </w:rPr>
-              <w:t xml:space="preserve">RF12, RF14</w:t>
+              <w:t>RF5</w:t>
             </w:r>
-            <w:r/>
           </w:p>
         </w:tc>
       </w:tr>
       <w:tr xmlns:wp14="http://schemas.microsoft.com/office/word/2010/wordml" wp14:textId="77777777">
         <w:trPr>
           <w:trHeight w:val="300"/>
+          <w:cantSplit/>
         </w:trPr>
         <w:tc>
           <w:tcPr>
@@ -1519,21 +1024,15 @@
               <w:rPr/>
             </w:pPr>
             <w:r>
-              <w:rPr>
-                <w:rFonts w:ascii="Aptos" w:hAnsi="Aptos" w:eastAsia="Aptos" w:cs="Aptos"/>
-                <w:sz w:val="24"/>
-                <w:szCs w:val="24"/>
-                <w:lang w:val="es-AR"/>
-              </w:rPr>
-              <w:t xml:space="preserve">RF13, RF26</w:t>
+              <w:t>RF6</w:t>
             </w:r>
-            <w:r/>
           </w:p>
         </w:tc>
       </w:tr>
       <w:tr xmlns:wp14="http://schemas.microsoft.com/office/word/2010/wordml" wp14:textId="77777777">
         <w:trPr>
           <w:trHeight w:val="300"/>
+          <w:cantSplit/>
         </w:trPr>
         <w:tc>
           <w:tcPr>
@@ -1584,15 +1083,15 @@
               <w:rPr/>
             </w:pPr>
             <w:r>
-              <w:t xml:space="preserve">RF15, RF16</w:t>
+              <w:t>RF6</w:t>
             </w:r>
-            <w:r/>
           </w:p>
         </w:tc>
       </w:tr>
       <w:tr xmlns:wp14="http://schemas.microsoft.com/office/word/2010/wordml" wp14:textId="77777777">
         <w:trPr>
           <w:trHeight w:val="300"/>
+          <w:cantSplit/>
         </w:trPr>
         <w:tc>
           <w:tcPr>
@@ -1649,21 +1148,15 @@
               <w:rPr/>
             </w:pPr>
             <w:r>
-              <w:rPr>
-                <w:rFonts w:ascii="Aptos" w:hAnsi="Aptos" w:eastAsia="Aptos" w:cs="Aptos"/>
-                <w:sz w:val="24"/>
-                <w:szCs w:val="24"/>
-                <w:lang w:val="es-AR"/>
-              </w:rPr>
-              <w:t xml:space="preserve">RF19, RF20</w:t>
+              <w:t>RF7</w:t>
             </w:r>
-            <w:r/>
           </w:p>
         </w:tc>
       </w:tr>
       <w:tr xmlns:wp14="http://schemas.microsoft.com/office/word/2010/wordml" wp14:textId="77777777">
         <w:trPr>
           <w:trHeight w:val="300"/>
+          <w:cantSplit/>
         </w:trPr>
         <w:tc>
           <w:tcPr>
@@ -1720,21 +1213,15 @@
               <w:rPr/>
             </w:pPr>
             <w:r>
-              <w:rPr>
-                <w:rFonts w:ascii="Aptos" w:hAnsi="Aptos" w:eastAsia="Aptos" w:cs="Aptos"/>
-                <w:sz w:val="24"/>
-                <w:szCs w:val="24"/>
-                <w:lang w:val="es-AR"/>
-              </w:rPr>
-              <w:t xml:space="preserve">RF21, RF22, RF23</w:t>
+              <w:t>RF9</w:t>
             </w:r>
-            <w:r/>
           </w:p>
         </w:tc>
       </w:tr>
       <w:tr xmlns:wp14="http://schemas.microsoft.com/office/word/2010/wordml" wp14:textId="77777777">
         <w:trPr>
           <w:trHeight w:val="300"/>
+          <w:cantSplit/>
         </w:trPr>
         <w:tc>
           <w:tcPr>
@@ -1791,21 +1278,15 @@
               <w:rPr/>
             </w:pPr>
             <w:r>
-              <w:rPr>
-                <w:rFonts w:ascii="Aptos" w:hAnsi="Aptos" w:eastAsia="Aptos" w:cs="Aptos"/>
-                <w:sz w:val="24"/>
-                <w:szCs w:val="24"/>
-                <w:lang w:val="es-AR"/>
-              </w:rPr>
-              <w:t xml:space="preserve">RF29</w:t>
+              <w:t>RF10</w:t>
             </w:r>
-            <w:r/>
           </w:p>
         </w:tc>
       </w:tr>
       <w:tr xmlns:wp14="http://schemas.microsoft.com/office/word/2010/wordml" wp14:textId="77777777">
         <w:trPr>
           <w:trHeight w:val="300"/>
+          <w:cantSplit/>
         </w:trPr>
         <w:tc>
           <w:tcPr>
@@ -1868,15 +1349,8 @@
               <w:rPr/>
             </w:pPr>
             <w:r>
-              <w:rPr>
-                <w:rFonts w:ascii="Aptos" w:hAnsi="Aptos" w:eastAsia="Aptos" w:cs="Aptos"/>
-                <w:sz w:val="24"/>
-                <w:szCs w:val="24"/>
-                <w:lang w:val="es-AR"/>
-              </w:rPr>
-              <w:t xml:space="preserve">RF4, RF8</w:t>
+              <w:t>RF2</w:t>
             </w:r>
-            <w:r/>
           </w:p>
         </w:tc>
       </w:tr>
@@ -1894,6 +1368,7 @@
     <w:p>
       <w:pPr>
         <w:pStyle w:val="677"/>
+        <w:keepNext/>
         <w:spacing/>
         <w:ind/>
         <w:rPr/>
@@ -1984,6 +1459,7 @@
     <w:p>
       <w:pPr>
         <w:pStyle w:val="677"/>
+        <w:keepNext/>
         <w:spacing/>
         <w:ind/>
         <w:rPr/>
@@ -2074,6 +1550,7 @@
     <w:p>
       <w:pPr>
         <w:pStyle w:val="677"/>
+        <w:keepNext/>
         <w:spacing/>
         <w:ind/>
         <w:rPr/>
@@ -2164,6 +1641,7 @@
     <w:p>
       <w:pPr>
         <w:pStyle w:val="677"/>
+        <w:keepNext/>
         <w:spacing/>
         <w:ind/>
         <w:rPr/>
@@ -2176,6 +1654,7 @@
     <w:p>
       <w:pPr>
         <w:pStyle w:val="677"/>
+        <w:keepNext/>
         <w:spacing/>
         <w:ind/>
         <w:rPr/>
@@ -2264,6 +1743,7 @@
     <w:p>
       <w:pPr>
         <w:pStyle w:val="677"/>
+        <w:keepNext/>
         <w:spacing/>
         <w:ind/>
         <w:rPr/>
@@ -2354,6 +1834,7 @@
     <w:p>
       <w:pPr>
         <w:pStyle w:val="677"/>
+        <w:keepNext/>
         <w:spacing/>
         <w:ind/>
         <w:rPr/>
@@ -2366,6 +1847,7 @@
     <w:p>
       <w:pPr>
         <w:pStyle w:val="677"/>
+        <w:keepNext/>
         <w:spacing/>
         <w:ind/>
         <w:rPr/>
@@ -2454,6 +1936,7 @@
     <w:p>
       <w:pPr>
         <w:pStyle w:val="677"/>
+        <w:keepNext/>
         <w:spacing/>
         <w:ind/>
         <w:rPr/>
@@ -2466,6 +1949,7 @@
     <w:p>
       <w:pPr>
         <w:pStyle w:val="677"/>
+        <w:keepNext/>
         <w:spacing/>
         <w:ind/>
         <w:rPr/>
@@ -2554,6 +2038,7 @@
     <w:p>
       <w:pPr>
         <w:pStyle w:val="677"/>
+        <w:keepNext/>
         <w:spacing/>
         <w:ind/>
         <w:rPr/>
@@ -2566,6 +2051,7 @@
     <w:p>
       <w:pPr>
         <w:pStyle w:val="677"/>
+        <w:keepNext/>
         <w:spacing/>
         <w:ind/>
         <w:rPr/>
@@ -2654,6 +2140,7 @@
     <w:p>
       <w:pPr>
         <w:pStyle w:val="677"/>
+        <w:keepNext/>
         <w:spacing/>
         <w:ind/>
         <w:rPr/>
@@ -2831,6 +2318,7 @@
     <w:p>
       <w:pPr>
         <w:pStyle w:val="677"/>
+        <w:keepNext/>
         <w:spacing/>
         <w:ind/>
         <w:rPr/>

</xml_diff>